<commit_message>
andy sync: PC 2026-10-20 16:25:11
</commit_message>
<xml_diff>
--- a/Software Engineering 1/Statisfied - Refined Thesis Title Proposals.docx
+++ b/Software Engineering 1/Statisfied - Refined Thesis Title Proposals.docx
@@ -42,7 +42,7 @@
           <w:i w:val="0"/>
           <w:sz w:val="30"/>
         </w:rPr>
-        <w:t xml:space="preserve">Material Demand and Inventory Planning for a Valenzuela Construction Firm Using LightGBM</w:t>
+        <w:t xml:space="preserve">Material Demand, Cost Overrun and Schedule Delay Prediction for a Valenzuela Construction Firm Using LightGBM</w:t>
       </w:r>
     </w:p>
     <w:p>
@@ -84,7 +84,7 @@
           <w:b w:val="0"/>
           <w:i w:val="0"/>
         </w:rPr>
-        <w:t xml:space="preserve">However, the studies found on construction materials mostly forecast material prices or list the factors behind material problems, and none found forecasts the quantity of materials that one Philippine construction and supply firm needs or turns that forecast into an ordering decision. This study addresses that gap with the firm's own history. It forecasts demand by material category and by item and checks that the item forecasts add up to the category totals. LightGBM will be the primary model, while a seasonal naive baseline, SARIMAX, XGBoost and one neural model will be the comparison models. Rainfall and typhoon season, fuel and commodity prices, the peso exchange rate and the government project calendar will be tested as possible drivers if the data can be joined lawfully. Model performance will be evaluated with rolling-origin cross-validation using the Mean Absolute Error and the Weighted Absolute Percentage Error.</w:t>
+        <w:t xml:space="preserve">However, the studies found on construction materials mostly forecast material prices or list the factors behind material problems, and none found forecasts the quantity of materials that one Philippine construction and supply firm needs or turns that forecast into an ordering decision. This study addresses that gap with the firm's own history. It forecasts demand by material category and by item and checks that the item forecasts add up to the category totals. It also uses the firm's project records to predict cost overrun and schedule delay, and tests whether material problems such as late deliveries, price changes since the quotation and stockouts help predict them. LightGBM will be the primary model, while a seasonal naive baseline, SARIMAX, XGBoost and one neural model will be the comparison models. Rainfall and typhoon season, fuel and commodity prices, the peso exchange rate and the government project calendar will be tested as possible drivers if the data can be joined lawfully. Model performance will be evaluated with rolling-origin cross-validation using the Mean Absolute Error and the Weighted Absolute Percentage Error.</w:t>
       </w:r>
     </w:p>
     <w:p>
@@ -98,7 +98,7 @@
           <w:b w:val="0"/>
           <w:i w:val="0"/>
         </w:rPr>
-        <w:t xml:space="preserve">The study aims to give the firm a demand forecast and a reorder guide, with proposed reorder points and safety stock tested in a simulation of stockout and holding costs. However, the topic is a working title that follows the records the firm is able to share. If the material records are not suitable, project cost or schedule records are the fallback, and the title would be revised. The results apply to this firm only.</w:t>
+        <w:t xml:space="preserve">The study aims to give the firm a demand forecast, a reorder guide with proposed reorder points and safety stock tested in a simulation of stockout and holding costs, and an early warning of the projects likely to run over cost or schedule. However, the topic is a working title that follows the records the firm is able to share. If the material records are not suitable, the project cost and schedule records become the main data, and the title would be revised. The results apply to this firm only.</w:t>
       </w:r>
     </w:p>
     <w:p>
@@ -129,7 +129,7 @@
           <w:b w:val="0"/>
           <w:i w:val="0"/>
         </w:rPr>
-        <w:t xml:space="preserve">Materials are a large part of what makes a construction project late or costly, and the Philippine studies keep naming them. Sumail et al. (2025) found material procurement delays among the top causes of delay and tied cost overruns to rising material costs, inflation and underestimated cost. Bascon et al. (2023) surveyed 69 contractor responses and found inflation, cost fluctuation and material delays among the top factors, and Layno and Famadico (2024) propose a framework of overrun factors and mitigation measures for public infrastructure. Jusoh and Kasim (2017) note that materials management is an important part of construction projects, yet little research covers it. Yet a firm still has to decide, every week, how much of each material to order. A forecast built from the firm's own history can make that decision more consistent and reduce late orders and excess stock.</w:t>
+        <w:t xml:space="preserve">Materials are a large part of what makes a construction project late or costly, and the Philippine studies keep naming them. Sumail et al. (2025) found material procurement delays among the top causes of delay and tied cost overruns to rising material costs, inflation and underestimated cost. Bascon et al. (2023) surveyed 69 contractor responses and found inflation, cost fluctuation and material delays among the top factors, and Layno and Famadico (2024) propose a framework of overrun factors and mitigation measures for public infrastructure. Jusoh and Kasim (2017) note that materials management is an important part of construction projects, yet little research covers it. Yet a firm still has to decide, every week, how much of each material to order. A forecast built from the firm's own history can make that decision more consistent and reduce late orders and excess stock. Project outcomes matter just as much. Gondia et al. (2020) apply machine learning to the risk of delay in construction projects, and Wang et al. (2012) predict the cost and schedule success of projects with neural network ensembles and support vector machines, which leaves open whether a firm's own material records help predict those outcomes.</w:t>
       </w:r>
     </w:p>
     <w:p>
@@ -143,7 +143,7 @@
           <w:b w:val="0"/>
           <w:i w:val="0"/>
         </w:rPr>
-        <w:t xml:space="preserve">Forecasting methods for this kind of data are well tested. Demand for construction materials is lumpy, with many weeks of zero and a few large orders, and Croston (1972) and Syntetos and Boylan (2005) designed methods for exactly that pattern, while Teunter et al. (2011) linked such forecasts to inventory that may become obsolete. Syntetos et al. (2016) review the gap between forecasting theory and practice in supply chains, which is the gap a reorder guide has to cross. Gradient boosting (Friedman, 2001; Chen &amp; Guestrin, 2016) is a standard machine learning method for tables of features, and LightGBM is an implementation that Ke et al. (2017) report trains up to over 20 times faster than conventional boosting with almost the same accuracy. SARIMAX is a classical time series model with outside variables (Hyndman &amp; Athanasopoulos, 2021), and Hewamalage et al. (2021) review recurrent neural networks for forecasting, so both give fair comparisons. The M5 competition set the task of forecasting 42,840 retail sales series (Makridakis et al., 2022), a current reference point for sales-type demand. SHAP explanations for tree models (Lundberg et al., 2020) can show which drivers move a forecast.</w:t>
+        <w:t xml:space="preserve">Forecasting methods for this kind of data are well tested. Demand for construction materials is lumpy, with many weeks of zero and a few large orders, and Croston (1972) and Syntetos and Boylan (2005) designed methods for exactly that pattern, while Teunter et al. (2011) linked such forecasts to inventory that may become obsolete. Syntetos et al. (2016) review the gap between forecasting theory and practice in supply chains, which is the gap a reorder guide has to cross. Gradient boosting (Chen &amp; Guestrin, 2016) is a standard machine learning method for tables of features, and LightGBM is an implementation that Ke et al. (2017) report trains up to over 20 times faster than conventional boosting with almost the same accuracy. SARIMAX is a classical time series model with outside variables (Hyndman &amp; Athanasopoulos, 2021), and Hewamalage et al. (2021) review recurrent neural networks for forecasting, so both give fair comparisons. SHAP explanations for tree models (Lundberg et al., 2020) can show which drivers move a forecast.</w:t>
       </w:r>
     </w:p>
     <w:p>
@@ -171,7 +171,7 @@
           <w:b w:val="0"/>
           <w:i w:val="0"/>
         </w:rPr>
-        <w:t xml:space="preserve">Most machine learning work on construction materials forecasts prices. Hosny et al. (2023) forecast monthly prices of steel, cement, brick, ceramic and gravel in Egypt with ARIMA and multiple regression, with errors of 1.4 to 2.8 percent. The Philippine studies found list the factors behind material problems or report survey perceptions (Sumail et al., 2025; Bascon et al., 2023). This study will contribute a demand forecast, consistent at the category and item levels, and a tested reorder guide for one Philippine construction and supply firm, while clearly keeping the results to that firm. The searches found no peer-reviewed study that does this, which means not found by these searches and not that none exists.</w:t>
+        <w:t xml:space="preserve">Most machine learning work on construction materials forecasts prices. Hosny et al. (2023) forecast monthly prices of steel, cement, brick, ceramic and gravel in Egypt with ARIMA and multiple regression, with errors of 1.4 to 2.8 percent. The Philippine studies found list the factors behind material problems or report survey perceptions (Sumail et al., 2025; Bascon et al., 2023). This study will contribute a demand forecast, consistent at the category and item levels, and a tested reorder guide for one Philippine construction and supply firm, while clearly keeping the results to that firm. The studies found on project overrun and delay do not use a firm's own material records to explain them. The searches found no peer-reviewed study that does either, which means not found by these searches and not that none exists.</w:t>
       </w:r>
     </w:p>
     <w:p>
@@ -202,7 +202,7 @@
           <w:b w:val="0"/>
           <w:i w:val="0"/>
         </w:rPr>
-        <w:t xml:space="preserve">A construction and supply firm orders materials from experience and from the projects in hand, but its purchase, delivery and supply records are not used to forecast how much of each material will be needed or when to reorder. The study addresses the problem of whether LightGBM, compared with seasonal, SARIMAX, XGBoost and neural baselines, can forecast demand with useful accuracy and support a reorder guide.</w:t>
+        <w:t xml:space="preserve">A construction and supply firm orders materials from experience and from the projects in hand, but its purchase, delivery and supply records are not used to forecast how much of each material will be needed or when to reorder, nor to warn which projects may run over cost or schedule. The study addresses the problem of whether LightGBM, compared with seasonal, SARIMAX, XGBoost and neural baselines, can forecast demand with useful accuracy, support a reorder guide and help predict project overrun and delay.</w:t>
       </w:r>
     </w:p>
     <w:p>
@@ -216,7 +216,7 @@
           <w:b w:val="0"/>
           <w:i w:val="0"/>
         </w:rPr>
-        <w:t xml:space="preserve">The study will answer the following problem: How can the purchase, delivery and supply records of a construction and supply firm be prepared and analyzed to forecast the demand for its materials by category and by item and to guide reorder points and safety stock?</w:t>
+        <w:t xml:space="preserve">The study will answer the following problem: How can the purchase, delivery, supply and project records of a construction and supply firm be prepared and analyzed to forecast the demand for its materials by category and by item, to guide reorder points and safety stock and to predict which projects may overrun cost or schedule?</w:t>
       </w:r>
     </w:p>
     <w:p>
@@ -261,7 +261,7 @@
           <w:b w:val="0"/>
           <w:i w:val="0"/>
         </w:rPr>
-        <w:t xml:space="preserve">To develop and evaluate a construction material demand forecasting and inventory planning system for Victor M. Daet Construction and Supply in Valenzuela City using LightGBM and comparison models.</w:t>
+        <w:t xml:space="preserve">To develop and evaluate a construction material demand forecasting, inventory planning and project overrun and delay prediction system for Victor M. Daet Construction and Supply in Valenzuela City using LightGBM and comparison models.</w:t>
       </w:r>
     </w:p>
     <w:p>
@@ -335,7 +335,17 @@
         <w:jc w:val="both"/>
       </w:pPr>
       <w:r>
-        <w:t xml:space="preserve">Explain the forecasts with SHAP, check whether the patterns stay stable over time, and deliver a dashboard of the forecast and the reorder guide for the firm's staff to test.</w:t>
+        <w:t xml:space="preserve">Develop LightGBM models for the cost overrun and the schedule delay of the firm's projects from the project records, compare them with a baseline of past project outcomes, and test whether late deliveries, price changes since the quotation and stockouts from the material records improve them.</w:t>
+      </w:r>
+    </w:p>
+    <w:p>
+      <w:pPr>
+        <w:pStyle w:val="ListBullet"/>
+        <w:spacing w:after="60"/>
+        <w:jc w:val="both"/>
+      </w:pPr>
+      <w:r>
+        <w:t xml:space="preserve">Explain the forecasts and the project models with SHAP, check whether the patterns stay stable over time, and deliver a dashboard of the forecast, the reorder guide and the project risk list for the firm's staff to test.</w:t>
       </w:r>
     </w:p>
     <w:p>
@@ -380,7 +390,7 @@
         <w:jc w:val="both"/>
       </w:pPr>
       <w:r>
-        <w:t xml:space="preserve">How accurately can demand be forecast by category and by item, do item forecasts add up to category totals, and does LightGBM beat the baselines?</w:t>
+        <w:t xml:space="preserve">How accurately can demand be forecast by category and by item, do item forecasts add up to category totals, does LightGBM beat the baselines, and do the outside drivers improve the forecasts?</w:t>
       </w:r>
     </w:p>
     <w:p>
@@ -394,7 +404,7 @@
         <w:jc w:val="both"/>
       </w:pPr>
       <w:r>
-        <w:t xml:space="preserve">Do the outside drivers improve the forecasts, and do the explanations stay stable over time?</w:t>
+        <w:t xml:space="preserve">Would the proposed reorder points have reduced stockouts and holding costs in a simulation of past weeks?</w:t>
       </w:r>
     </w:p>
     <w:p>
@@ -408,7 +418,7 @@
         <w:jc w:val="both"/>
       </w:pPr>
       <w:r>
-        <w:t xml:space="preserve">Would the proposed reorder points have reduced stockouts and holding costs in a simulation of past weeks?</w:t>
+        <w:t xml:space="preserve">Do late deliveries, price changes since the quotation and stockouts help predict which projects overrun their cost or schedule?</w:t>
       </w:r>
     </w:p>
     <w:p>
@@ -508,7 +518,7 @@
               <w:rPr>
                 <w:sz w:val="22"/>
               </w:rPr>
-              <w:t xml:space="preserve">Victor M. Daet Construction and Supply material purchase, delivery and supply records (private business records)</w:t>
+              <w:t xml:space="preserve">Victor M. Daet Construction and Supply material purchase, delivery and supply records, and project cost and schedule records (private business records)</w:t>
             </w:r>
           </w:p>
         </w:tc>
@@ -582,7 +592,7 @@
               <w:rPr>
                 <w:sz w:val="22"/>
               </w:rPr>
-              <w:t xml:space="preserve">One material line of a purchase, a delivery to a project, or a supply order</w:t>
+              <w:t xml:space="preserve">One material line of a purchase, a delivery to a project, or a supply order; and one project for the overrun and delay outcomes</w:t>
             </w:r>
           </w:p>
         </w:tc>
@@ -619,7 +629,7 @@
               <w:rPr>
                 <w:sz w:val="22"/>
               </w:rPr>
-              <w:t xml:space="preserve">Weekly quantity needed of each material, by category and by item (forecasting)</w:t>
+              <w:t xml:space="preserve">Weekly quantity needed of each material, by category and by item (forecasting); cost overrun and schedule delay of each project</w:t>
             </w:r>
           </w:p>
         </w:tc>
@@ -656,7 +666,7 @@
               <w:rPr>
                 <w:sz w:val="22"/>
               </w:rPr>
-              <w:t xml:space="preserve">Week, month, rainy or dry season, holiday indicator, material and unit, unit price, number and start dates of active projects (coded), supplier code, recent demand, days since the last order; rainfall and typhoon season, fuel and commodity prices, exchange rate and the government project calendar if available and lawful</w:t>
+              <w:t xml:space="preserve">Week, month, rainy or dry season, holiday indicator, material and unit, unit price, number and start dates of active projects (coded), supplier code, recent demand, days since the last order; rainfall and typhoon season, fuel and commodity prices, exchange rate and the government project calendar if available and lawful. For projects: budget, planned and actual dates, project type and size, and from the material records the number of late deliveries, price change since the quotation and stockouts</w:t>
             </w:r>
           </w:p>
         </w:tc>
@@ -962,7 +972,7 @@
               <w:rPr>
                 <w:sz w:val="22"/>
               </w:rPr>
-              <w:t xml:space="preserve">Train LightGBM as the primary model and compare it with a seasonal naive baseline, SARIMAX, XGBoost and one neural model, with item forecasts checked against category totals.</w:t>
+              <w:t xml:space="preserve">Train LightGBM as the primary model and compare it with a seasonal naive baseline, SARIMAX, XGBoost and one neural model, with item forecasts checked against category totals. Train LightGBM models for project cost overrun and schedule delay on earlier projects and test them on later projects, with and without the material features.</w:t>
             </w:r>
           </w:p>
         </w:tc>
@@ -1128,7 +1138,7 @@
         <w:jc w:val="both"/>
       </w:pPr>
       <w:r>
-        <w:t xml:space="preserve">It forecasts demand by material category and by item and proposes reorder points and safety stock for the firm's main materials.</w:t>
+        <w:t xml:space="preserve">It forecasts demand by material category and by item, proposes reorder points and safety stock for the firm's main materials, and predicts cost overrun and schedule delay for the firm's projects.</w:t>
       </w:r>
     </w:p>
     <w:p>
@@ -1173,6 +1183,16 @@
       </w:pPr>
       <w:r>
         <w:t xml:space="preserve">Accuracy depends on how complete and consistent the firm's records are, and the inventory simulation needs stock, lead-time and cost records that may not exist.</w:t>
+      </w:r>
+    </w:p>
+    <w:p>
+      <w:pPr>
+        <w:pStyle w:val="ListBullet"/>
+        <w:spacing w:after="60"/>
+        <w:jc w:val="both"/>
+      </w:pPr>
+      <w:r>
+        <w:t xml:space="preserve">The project models may have wide ranges if the firm has few finished projects, and they need project budgets and dates that may not be kept in a usable form.</w:t>
       </w:r>
     </w:p>
     <w:p>
@@ -1344,7 +1364,7 @@
         <w:jc w:val="both"/>
       </w:pPr>
       <w:r>
-        <w:t xml:space="preserve">A dashboard with the forecast, the reorder points and safety stock.</w:t>
+        <w:t xml:space="preserve">A dashboard with the forecast, the reorder points and safety stock, and a project risk list.</w:t>
       </w:r>
     </w:p>
     <w:p>
@@ -1354,7 +1374,7 @@
         <w:jc w:val="both"/>
       </w:pPr>
       <w:r>
-        <w:t xml:space="preserve">A simulation of stockout and holding costs, and a discussion of the limits of forecasting demand for one firm.</w:t>
+        <w:t xml:space="preserve">A simulation of stockout and holding costs, overrun and delay models with and without the material features, and a discussion of the limits of modeling one firm.</w:t>
       </w:r>
     </w:p>
     <w:p>
@@ -1446,7 +1466,7 @@
           <w:b w:val="0"/>
           <w:i w:val="0"/>
         </w:rPr>
-        <w:t xml:space="preserve">Friedman, J. H. (2001). Greedy function approximation: A gradient boosting machine. The Annals of Statistics, 29(5), 1189-1232. doi:10.1214/aos/1013203451</w:t>
+        <w:t xml:space="preserve">Gondia, A., Siam, A., El-Dakhakhni, W., &amp; Nassar, A. H. (2020). Machine learning algorithms for construction projects delay risk prediction. Journal of Construction Engineering and Management, 146(1). doi:10.1061/(ASCE)CO.1943-7862.0001736</w:t>
       </w:r>
     </w:p>
     <w:p>
@@ -1581,21 +1601,6 @@
           <w:b w:val="0"/>
           <w:i w:val="0"/>
         </w:rPr>
-        <w:t xml:space="preserve">Makridakis, S., Spiliotis, E., &amp; Assimakopoulos, V. (2022). M5 accuracy competition: Results, findings, and conclusions. International Journal of Forecasting, 38(4), 1346-1364. doi:10.1016/j.ijforecast.2021.11.013</w:t>
-      </w:r>
-    </w:p>
-    <w:p>
-      <w:pPr>
-        <w:keepNext w:val="0"/>
-        <w:spacing w:after="80"/>
-        <w:ind w:left="720" w:hanging="720"/>
-        <w:jc w:val="left"/>
-      </w:pPr>
-      <w:r>
-        <w:rPr>
-          <w:b w:val="0"/>
-          <w:i w:val="0"/>
-        </w:rPr>
         <w:t xml:space="preserve">Republic Act No. 10173. (2012). Data Privacy Act of 2012. Retrieved from https://www.lawphil.net/statutes/repacts/ra2012/ra_10173_2012.html</w:t>
       </w:r>
     </w:p>
@@ -1672,6 +1677,21 @@
           <w:i w:val="0"/>
         </w:rPr>
         <w:t xml:space="preserve">United Nations. (2015). Transforming our world: The 2030 agenda for sustainable development. Retrieved from https://sdgs.un.org/2030agenda</w:t>
+      </w:r>
+    </w:p>
+    <w:p>
+      <w:pPr>
+        <w:keepNext w:val="0"/>
+        <w:spacing w:after="80"/>
+        <w:ind w:left="720" w:hanging="720"/>
+        <w:jc w:val="left"/>
+      </w:pPr>
+      <w:r>
+        <w:rPr>
+          <w:b w:val="0"/>
+          <w:i w:val="0"/>
+        </w:rPr>
+        <w:t xml:space="preserve">Wang, Y.-R., Yu, C.-Y., &amp; Chan, H.-H. (2012). Predicting construction cost and schedule success using artificial neural networks ensemble and support vector machines classification models. International Journal of Project Management, 30(4), 470-478. doi:10.1016/j.ijproman.2011.09.002</w:t>
       </w:r>
     </w:p>
     <w:p>
@@ -3386,7 +3406,7 @@
           <w:i w:val="0"/>
           <w:sz w:val="30"/>
         </w:rPr>
-        <w:t xml:space="preserve">Demand Forecasting, Customer Retention and Delivery Planning for a San Juan Water Supplier Using XGBoost</w:t>
+        <w:t xml:space="preserve">Demand Forecasting and Delivery Planning for Water Stations in San Juan and Marikina Using XGBoost</w:t>
       </w:r>
     </w:p>
     <w:p>
@@ -3414,7 +3434,7 @@
           <w:b w:val="0"/>
           <w:i w:val="0"/>
         </w:rPr>
-        <w:t xml:space="preserve">Drinking water is a daily purchase, and a small supplier plans its stock, staff and delivery trips from experience, which is difficult when demand changes with the season, the weekday, holidays and the way customers order. Alpha Pi Water, a bottled water supplier in San Juan City that sells oxygenated and alkaline drinking water and shares its owner with Dr. Pi Oxygenated Water, needs a better basis for planning. This study proposes a predictive analytics system that uses the supplier's own sales and delivery records to forecast demand, to flag regular customers who may be lapsing and to plan delivery trips. The records will be obtained from the owner with written permission and anonymized before they reach the group, and they must start in 2021 or later with at least 5,000 rows.</w:t>
+        <w:t xml:space="preserve">Drinking water is a daily purchase, and a small water station plans its stock, staff and delivery trips from experience, which is difficult when demand changes with the season, the weekday, holidays and the way customers order. Alpha Pi Water in San Juan City and Dr. Pi Oxygenated Water in Marikina City, two stations that sell oxygenated and alkaline drinking water and share one owner, need a better basis for planning both stations together. This study proposes a predictive analytics system that uses the two stations' own sales and delivery records to forecast demand at each station and for the pair, to flag regular customers who may be lapsing, to plan delivery routes from both stations and to test whether moving stock between the stations would reduce stockouts. The records will be obtained from the owner with written permission and anonymized before they reach the group, and they must start in 2021 or later with at least 5,000 rows, which two stations make easier to reach.</w:t>
       </w:r>
     </w:p>
     <w:p>
@@ -3428,7 +3448,7 @@
           <w:b w:val="0"/>
           <w:i w:val="0"/>
         </w:rPr>
-        <w:t xml:space="preserve">However, the Philippine studies found on water businesses focus on sanitation and compliance at refilling stations, and none of the studies found forecasts demand, predicts customer retention and plans deliveries for a small water supplier. This study addresses that gap in three linked parts. Daily demand is forecast by product and by order channel and checked so that the parts add up to the total. A repeat-buying probability model is compared with an XGBoost classifier to flag lapsing customers. The next-day forecast by area is then used to plan delivery routes with a savings heuristic, and the trips and distance saved are tested in a simulation against the supplier's current routes if the records support it. XGBoost will be the primary forecasting model, while a seasonal naive baseline, ARIMA and Prophet will be the comparison models, evaluated with time-based cross-validation using Mean Absolute Error and Weighted Absolute Percentage Error.</w:t>
+        <w:t xml:space="preserve">However, the Philippine studies found on water businesses focus on sanitation and compliance at refilling stations, and none of the studies found forecasts demand, predicts customer retention, and plans deliveries and stock for a small group of stations. This study addresses that gap in four linked parts. Daily demand is forecast at each station and for the pair, comparing one model per station with one pooled XGBoost model trained on both, and reconciling the forecasts so that the stations add up to the total. A repeat-buying probability model is compared with an XGBoost classifier to flag lapsing customers. Each delivery area is assigned to the nearer station and routes from both stations are planned with a savings heuristic, with the trips and distance saved tested in a simulation. Finally, a stock balancing rule that moves stock between the stations is tested in a simulation of stockouts and excess stock. A seasonal naive baseline, ARIMA and Prophet will be the comparison models for the forecasts, evaluated with time-based cross-validation using Mean Absolute Error and Weighted Absolute Percentage Error.</w:t>
       </w:r>
     </w:p>
     <w:p>
@@ -3442,7 +3462,7 @@
           <w:b w:val="0"/>
           <w:i w:val="0"/>
         </w:rPr>
-        <w:t xml:space="preserve">The study aims to give the owner a forecast, a follow-up list and a delivery plan that can be used for weekly planning. However, the results apply to one supplier and its two names, they are forecasts and not guarantees, and the business details above come from the supplier's public Facebook pages and are [to confirm with the client].</w:t>
+        <w:t xml:space="preserve">The study aims to give the owner a forecast, a follow-up list, a delivery plan and a stock balancing guide that can be used for weekly planning. However, the results apply to these two stations, they are forecasts and not guarantees, and the business details above come from the stations' public Facebook pages and are [to confirm with the client].</w:t>
       </w:r>
     </w:p>
     <w:p>
@@ -3473,7 +3493,7 @@
           <w:b w:val="0"/>
           <w:i w:val="0"/>
         </w:rPr>
-        <w:t xml:space="preserve">Drinking water businesses in the Philippines operate under national sanitation rules, which include Presidential Decree No. 856 (1975) and the Department of Health's supplemental implementing rules (1999), and which rules apply to a bottled supplier is [to confirm with the client]. Yet a supplier still has to decide each day how much water to prepare, how many delivery trips to schedule and which customers to follow up. A wrong guess means empty stock and lost sales, or idle staff and wasted trips. Customers also buy without any contract, so a regular customer who quietly stops ordering is hard to notice. A forecast built from the supplier's own records can organize these patterns and give the owner a consistent basis for planning.</w:t>
+        <w:t xml:space="preserve">Drinking water businesses in the Philippines operate under national sanitation rules, which include Presidential Decree No. 856 (1975) and the Department of Health's supplemental implementing rules (1999), and which rules apply to these stations is [to confirm with the client]. Yet an owner with two stations still has to decide each day how much water each station should prepare, how many delivery trips to schedule from each and which customers to follow up. A wrong guess means empty stock and lost sales at one station while the other has stock to spare, or idle staff and wasted trips. Customers also buy without any contract, so a regular customer who quietly stops ordering is hard to notice. A forecast built from the stations' own records can organize these patterns and give the owner a consistent basis for planning.</w:t>
       </w:r>
     </w:p>
     <w:p>
@@ -3487,7 +3507,7 @@
           <w:b w:val="0"/>
           <w:i w:val="0"/>
         </w:rPr>
-        <w:t xml:space="preserve">Forecasting methods for this kind of data are well tested. Hyndman and Athanasopoulos (2021) cover the baselines and the accuracy measures, Taylor and Letham (2018) describe Prophet for data with seasonality and holidays, and Makridakis et al. (2020) compare statistical and machine learning methods on 100,000 series. Gradient boosting methods such as XGBoost (Chen &amp; Guestrin, 2016) are standard for tables of features, and the cross-validation of time series has to respect time order (Bergmeir &amp; Benítez, 2012). When demand is split by product and by channel, the parts should add up to the total, and Hyndman et al. (2011) and Wickramasuriya et al. (2019) show how to reconcile forecasts of such hierarchies. For customers who buy without a contract, Buckinx and Van den Poel (2005) study partial defection of loyal customers in a non-contractual retail setting, Fader et al. (2005) model repeat buying from recency and frequency, Akhmetbek (2022) predicts churn in retail from purchase behavior, and Verbeke et al. (2012) evaluate churn models by profit. Delivery planning is a vehicle routing problem, first formulated as the truck dispatching problem (Dantzig &amp; Ramser, 1959), and the savings method of Clarke and Wright (1964) gives routes from a central depot to a number of delivery points.</w:t>
+        <w:t xml:space="preserve">Forecasting methods for this kind of data are well tested. Hyndman and Athanasopoulos (2021) cover the baselines and the accuracy measures, Taylor and Letham (2018) describe Prophet for data with seasonality and holidays, and Makridakis et al. (2020) compare statistical and machine learning methods on 100,000 series. Gradient boosting methods such as XGBoost (Chen &amp; Guestrin, 2016) are standard for tables of features, and the cross-validation of time series has to respect time order (Bergmeir &amp; Benítez, 2012). With two stations, Montero-Manso and Hyndman (2021) discuss when one model for a group of series (a global model) is better than one model for each series (a local model), and when the stations are also summed into a total, Hyndman et al. (2011) and Wickramasuriya et al. (2019) show how to reconcile forecasts of such hierarchies. For customers who buy without a contract, Buckinx and Van den Poel (2005) study partial defection of loyal customers in a non-contractual retail setting and Fader et al. (2005) model repeat buying from recency and frequency. Delivery planning from more than one station is a vehicle routing problem with multiple depots, reviewed by Montoya-Torres et al. (2015), and the savings method of Clarke and Wright (1964) gives routes from a central depot to a number of delivery points. Paterson et al. (2011) review inventory models in which stock is moved between locations (lateral transshipment), which is the idea behind balancing stock between two stations.</w:t>
       </w:r>
     </w:p>
     <w:p>
@@ -3515,7 +3535,7 @@
           <w:b w:val="0"/>
           <w:i w:val="0"/>
         </w:rPr>
-        <w:t xml:space="preserve">The Philippine studies about water refilling stations, the closest local businesses found, deal with sanitation, operator practices and water safety plans (Cope et al., 2013; Molina et al., 2016). The forecasting studies found, such as Makridakis et al. (2020), use large public series and not a small business's own records. This study will contribute a Philippine small-business case that links demand forecasting, a customer retention flag and delivery planning, while clearly keeping the results to one supplier. This means not found by these searches and not that none exists.</w:t>
+        <w:t xml:space="preserve">The Philippine studies about water refilling stations, the closest local businesses found, deal with sanitation, operator practices and water safety plans (Cope et al., 2013; Molina et al., 2016). The forecasting studies found, such as Makridakis et al. (2020), use large public series and not a small business's own records. This study will contribute a Philippine small-business case that links demand forecasting, a customer retention flag, delivery planning and stock balancing across two stations with one owner, while clearly keeping the results to these two stations. This means not found by these searches and not that none exists.</w:t>
       </w:r>
     </w:p>
     <w:p>
@@ -3546,7 +3566,7 @@
           <w:b w:val="0"/>
           <w:i w:val="0"/>
         </w:rPr>
-        <w:t xml:space="preserve">A small water supplier records its sales and deliveries, but it may not use them to plan ahead. Without a data-driven method, stock, staff and delivery trips are planned from experience, and lapsing customers are noticed late. The study addresses the problem of whether XGBoost, compared with simple forecasting baselines, can predict demand, whether a repeat-buying model or a classifier better identifies customers who may stop ordering, and whether the forecast can reduce delivery trips.</w:t>
+        <w:t xml:space="preserve">An owner with two small water stations records sales and deliveries, but may not use them to plan ahead or to plan the two stations together. Without a data-driven method, stock, staff and delivery trips are planned from experience, one station can run out while the other has stock, and lapsing customers are noticed late. The study addresses the problem of whether XGBoost, compared with simple forecasting baselines, can predict demand at each station, whether one pooled model beats one model per station, whether a repeat-buying model or a classifier better identifies customers who may stop ordering, and whether the forecasts can reduce delivery trips and stockouts.</w:t>
       </w:r>
     </w:p>
     <w:p>
@@ -3560,7 +3580,7 @@
           <w:b w:val="0"/>
           <w:i w:val="0"/>
         </w:rPr>
-        <w:t xml:space="preserve">The study will answer the following problem: How can the sales and delivery records of a small water supplier be prepared and analyzed to forecast demand by product and channel, to identify customers who may stop ordering and to plan delivery routes?</w:t>
+        <w:t xml:space="preserve">The study will answer the following problem: How can the sales and delivery records of two small water stations be prepared and analyzed to forecast demand at each station and for the pair, to identify customers who may stop ordering, to plan delivery routes from both stations and to balance stock between them?</w:t>
       </w:r>
     </w:p>
     <w:p>
@@ -3605,7 +3625,7 @@
           <w:b w:val="0"/>
           <w:i w:val="0"/>
         </w:rPr>
-        <w:t xml:space="preserve">To develop and evaluate a demand forecasting, customer retention and delivery planning system for Alpha Pi Water in San Juan City, including its sister name Dr. Pi Oxygenated Water, using XGBoost and baseline methods.</w:t>
+        <w:t xml:space="preserve">To develop and evaluate a demand forecasting, customer retention, delivery planning and stock balancing system for Alpha Pi Water in San Juan City and Dr. Pi Oxygenated Water in Marikina City using XGBoost and baseline methods.</w:t>
       </w:r>
     </w:p>
     <w:p>
@@ -3629,7 +3649,7 @@
         <w:jc w:val="both"/>
       </w:pPr>
       <w:r>
-        <w:t xml:space="preserve">Obtain, clean and anonymize the supplier's sales and delivery records from 2021 onward, and profile missing, duplicated and inconsistent records.</w:t>
+        <w:t xml:space="preserve">Obtain, clean and anonymize the two stations' sales and delivery records from 2021 onward, and profile missing, duplicated and inconsistent records at each station.</w:t>
       </w:r>
     </w:p>
     <w:p>
@@ -3639,7 +3659,7 @@
         <w:jc w:val="both"/>
       </w:pPr>
       <w:r>
-        <w:t xml:space="preserve">Analyze how demand changes with the weekday, the day of the month, holidays, the product, the order channel (for example delivery or pick-up) and the delivery area, if the records show them.</w:t>
+        <w:t xml:space="preserve">Analyze how demand changes with the weekday, the day of the month, holidays, the product, the order channel (for example delivery or pick-up) and the delivery area, and compare the two stations.</w:t>
       </w:r>
     </w:p>
     <w:p>
@@ -3649,7 +3669,7 @@
         <w:jc w:val="both"/>
       </w:pPr>
       <w:r>
-        <w:t xml:space="preserve">Forecast daily demand by product and by channel with XGBoost, compare it with a seasonal naive baseline, ARIMA and Prophet, and reconcile the forecasts so that the parts add up to the total.</w:t>
+        <w:t xml:space="preserve">Forecast daily demand at each station with XGBoost, compare one model per station with one pooled model trained on both, compare them with a seasonal naive baseline, ARIMA and Prophet, and reconcile the forecasts so that the stations add up to the total.</w:t>
       </w:r>
     </w:p>
     <w:p>
@@ -3669,7 +3689,7 @@
         <w:jc w:val="both"/>
       </w:pPr>
       <w:r>
-        <w:t xml:space="preserve">Flag lapsing customers with a repeat-buying probability model and with an XGBoost classifier, compare them on later periods, and check that the flags are calibrated.</w:t>
+        <w:t xml:space="preserve">Flag lapsing customers with a repeat-buying probability model and with an XGBoost classifier, compare them on later periods, check that the flags are calibrated, and note customers who buy from both stations if they can be matched by anonymous code.</w:t>
       </w:r>
     </w:p>
     <w:p>
@@ -3679,7 +3699,17 @@
         <w:jc w:val="both"/>
       </w:pPr>
       <w:r>
-        <w:t xml:space="preserve">Plan delivery routes from the next-day forecast by area with a savings heuristic, simulate the trips and distance saved against the current routes if trip and address records exist, and deliver a dashboard with the forecast, the follow-up list and the route plan for the owner to test.</w:t>
+        <w:t xml:space="preserve">Assign each delivery area to the nearer station, plan routes from both stations with a savings heuristic, and simulate the trips and distance saved against the current routes if trip and address records exist.</w:t>
+      </w:r>
+    </w:p>
+    <w:p>
+      <w:pPr>
+        <w:pStyle w:val="ListBullet"/>
+        <w:spacing w:after="60"/>
+        <w:jc w:val="both"/>
+      </w:pPr>
+      <w:r>
+        <w:t xml:space="preserve">Test a rule for moving stock between the two stations in a simulation of stockouts and excess stock if stock records exist, and deliver a dashboard with the forecasts, the follow-up list, the route plan and the stock balancing guide for the owner to test.</w:t>
       </w:r>
     </w:p>
     <w:p>
@@ -3710,7 +3740,7 @@
         <w:jc w:val="both"/>
       </w:pPr>
       <w:r>
-        <w:t xml:space="preserve">What patterns appear in the supplier's demand across weekdays, months, holidays, products and channels?</w:t>
+        <w:t xml:space="preserve">What patterns appear in demand across weekdays, months, holidays, products and channels, and how do the two stations differ?</w:t>
       </w:r>
     </w:p>
     <w:p>
@@ -3724,7 +3754,7 @@
         <w:jc w:val="both"/>
       </w:pPr>
       <w:r>
-        <w:t xml:space="preserve">How accurately can daily demand be forecast, does XGBoost beat the simple baselines, and do the reconciled forecasts add up to the total?</w:t>
+        <w:t xml:space="preserve">How accurately can daily demand be forecast, does XGBoost beat the simple baselines, and does one pooled model beat one model per station?</w:t>
       </w:r>
     </w:p>
     <w:p>
@@ -3752,7 +3782,7 @@
         <w:jc w:val="both"/>
       </w:pPr>
       <w:r>
-        <w:t xml:space="preserve">Would route plans built from the forecast have reduced delivery trips and distance in a simulation of past days?</w:t>
+        <w:t xml:space="preserve">Would route plans from both stations and moving stock between the stations have reduced delivery trips, distance, stockouts and excess stock in a simulation of past days and weeks?</w:t>
       </w:r>
     </w:p>
     <w:p>
@@ -3852,7 +3882,7 @@
               <w:rPr>
                 <w:sz w:val="22"/>
               </w:rPr>
-              <w:t xml:space="preserve">Alpha Pi Water (and Dr. Pi Oxygenated Water) sales and delivery records (private business records)</w:t>
+              <w:t xml:space="preserve">Sales and delivery records of Alpha Pi Water (San Juan) and Dr. Pi Oxygenated Water (Marikina), one owner (private business records)</w:t>
             </w:r>
           </w:p>
         </w:tc>
@@ -3926,7 +3956,7 @@
               <w:rPr>
                 <w:sz w:val="22"/>
               </w:rPr>
-              <w:t xml:space="preserve">One sale or delivery order</w:t>
+              <w:t xml:space="preserve">One sale or delivery order at one station</w:t>
             </w:r>
           </w:p>
         </w:tc>
@@ -3963,7 +3993,7 @@
               <w:rPr>
                 <w:sz w:val="22"/>
               </w:rPr>
-              <w:t xml:space="preserve">Daily demand in units sold by product and channel (forecasting), a lapsed-customer flag (retention), and trips and distance (route simulation)</w:t>
+              <w:t xml:space="preserve">Daily demand in units sold at each station and in total (forecasting), a lapsed-customer flag (retention), trips and distance (route simulation), and stockouts and excess stock (balancing simulation)</w:t>
             </w:r>
           </w:p>
         </w:tc>
@@ -4000,7 +4030,7 @@
               <w:rPr>
                 <w:sz w:val="22"/>
               </w:rPr>
-              <w:t xml:space="preserve">Date, weekday, day of month, holiday indicator, product, order channel, delivery area, quantity, anonymous customer code, days since last order, order frequency</w:t>
+              <w:t xml:space="preserve">Station, date, weekday, day of month, holiday indicator, product, order channel, delivery area, quantity, anonymous customer code, days since last order, order frequency</w:t>
             </w:r>
           </w:p>
         </w:tc>
@@ -4037,7 +4067,7 @@
               <w:rPr>
                 <w:sz w:val="22"/>
               </w:rPr>
-              <w:t xml:space="preserve">To be confirmed, including whether the two names keep one record or two, and whether delivery areas and trips are recorded. The adviser's rule is at least 5,000 rows from 2021 onward</w:t>
+              <w:t xml:space="preserve">To be confirmed for each station, including whether the two keep one record or two, and whether delivery areas, trips and stock are recorded. The adviser's rule is at least 5,000 rows from 2021 onward</w:t>
             </w:r>
           </w:p>
         </w:tc>
@@ -4065,7 +4095,7 @@
         <w:jc w:val="both"/>
       </w:pPr>
       <w:r>
-        <w:t xml:space="preserve">Remove exact duplicates and check missing or invalid dates and quantities.</w:t>
+        <w:t xml:space="preserve">Remove exact duplicates and check missing or invalid dates and quantities at each station.</w:t>
       </w:r>
     </w:p>
     <w:p>
@@ -4085,7 +4115,7 @@
         <w:jc w:val="both"/>
       </w:pPr>
       <w:r>
-        <w:t xml:space="preserve">Aggregate the orders to daily demand by product, channel and area, and decide with the owner whether the two names are analyzed together or separately.</w:t>
+        <w:t xml:space="preserve">Put the two stations' records in one format, keep a station column, and aggregate the orders to daily demand by station, product, channel and area.</w:t>
       </w:r>
     </w:p>
     <w:p>
@@ -4195,7 +4225,7 @@
               <w:rPr>
                 <w:sz w:val="22"/>
               </w:rPr>
-              <w:t xml:space="preserve">Meet the owner, confirm what the supplier records and how orders are taken, and sign the data permission.</w:t>
+              <w:t xml:space="preserve">Meet the owner, confirm what each station records and how orders are taken, and sign the data permission.</w:t>
             </w:r>
           </w:p>
         </w:tc>
@@ -4232,7 +4262,7 @@
               <w:rPr>
                 <w:sz w:val="22"/>
               </w:rPr>
-              <w:t xml:space="preserve">Summarize demand by weekday, month, product, channel and area, and check missing values and duplicates.</w:t>
+              <w:t xml:space="preserve">Summarize demand by weekday, month, product, channel, area and station, and check missing values and duplicates.</w:t>
             </w:r>
           </w:p>
         </w:tc>
@@ -4269,7 +4299,7 @@
               <w:rPr>
                 <w:sz w:val="22"/>
               </w:rPr>
-              <w:t xml:space="preserve">Clean the records, anonymize customers and build calendar, area and customer features.</w:t>
+              <w:t xml:space="preserve">Clean the records, anonymize customers, harmonize the two stations' formats and build calendar, area and customer features.</w:t>
             </w:r>
           </w:p>
         </w:tc>
@@ -4306,7 +4336,7 @@
               <w:rPr>
                 <w:sz w:val="22"/>
               </w:rPr>
-              <w:t xml:space="preserve">Train XGBoost as the primary forecasting model and compare it with a seasonal naive baseline, ARIMA and Prophet, then reconcile the product and channel forecasts. Compare a repeat-buying model with an XGBoost classifier for lapsing customers.</w:t>
+              <w:t xml:space="preserve">Train XGBoost per station and as one pooled model, compare them with a seasonal naive baseline, ARIMA and Prophet, and reconcile the station forecasts to the total. Compare a repeat-buying model with an XGBoost classifier for lapsing customers.</w:t>
             </w:r>
           </w:p>
         </w:tc>
@@ -4343,7 +4373,7 @@
               <w:rPr>
                 <w:sz w:val="22"/>
               </w:rPr>
-              <w:t xml:space="preserve">Use time-based cross-validation and report MAE and WAPE (Hyndman &amp; Koehler, 2006) on unseen periods, the calibration of the lapsing flags, and the trips and distance saved in the route simulation.</w:t>
+              <w:t xml:space="preserve">Use time-based cross-validation and report MAE and WAPE (Hyndman &amp; Koehler, 2006) on unseen periods, the calibration of the lapsing flags, the trips and distance saved in the route simulation, and the stockouts and excess stock in the balancing simulation.</w:t>
             </w:r>
           </w:p>
         </w:tc>
@@ -4380,7 +4410,7 @@
               <w:rPr>
                 <w:sz w:val="22"/>
               </w:rPr>
-              <w:t xml:space="preserve">Build the dashboard with the forecast, the follow-up list and the route plan.</w:t>
+              <w:t xml:space="preserve">Build the dashboard with the forecasts, the follow-up list, the route plan and the stock balancing guide.</w:t>
             </w:r>
           </w:p>
         </w:tc>
@@ -4417,7 +4447,7 @@
               <w:rPr>
                 <w:sz w:val="22"/>
               </w:rPr>
-              <w:t xml:space="preserve">Use feature importance to explain what drives the forecast and the lapsing flags.</w:t>
+              <w:t xml:space="preserve">Use feature importance to explain what drives the forecasts and the lapsing flags, and describe how the two stations differ.</w:t>
             </w:r>
           </w:p>
         </w:tc>
@@ -4462,7 +4492,7 @@
         <w:jc w:val="both"/>
       </w:pPr>
       <w:r>
-        <w:t xml:space="preserve">The study covers one supplier, Alpha Pi Water in San Juan City, with its sister name Dr. Pi Oxygenated Water if the records include it, and its records from 2021 onward.</w:t>
+        <w:t xml:space="preserve">The study covers two stations of one owner, Alpha Pi Water in San Juan City and Dr. Pi Oxygenated Water in Marikina City, and their records from 2021 onward.</w:t>
       </w:r>
     </w:p>
     <w:p>
@@ -4472,7 +4502,7 @@
         <w:jc w:val="both"/>
       </w:pPr>
       <w:r>
-        <w:t xml:space="preserve">It forecasts daily and weekly demand up to four weeks ahead, flags customers at risk of lapsing and proposes delivery routes for the next day.</w:t>
+        <w:t xml:space="preserve">It forecasts daily and weekly demand up to four weeks ahead, flags customers at risk of lapsing, proposes next-day delivery routes from both stations and tests a stock balancing rule.</w:t>
       </w:r>
     </w:p>
     <w:p>
@@ -4482,7 +4512,7 @@
         <w:jc w:val="both"/>
       </w:pPr>
       <w:r>
-        <w:t xml:space="preserve">Calendar and holiday variables are the main inputs. Outside data such as weather is used only if the supplier supplies it.</w:t>
+        <w:t xml:space="preserve">Calendar and holiday variables are the main inputs. Outside data such as weather is used only if the owner supplies it.</w:t>
       </w:r>
     </w:p>
     <w:p>
@@ -4506,7 +4536,7 @@
         <w:jc w:val="both"/>
       </w:pPr>
       <w:r>
-        <w:t xml:space="preserve">The results apply to this supplier and may not hold for other suppliers.</w:t>
+        <w:t xml:space="preserve">The results apply to these two stations and may not hold for other stations.</w:t>
       </w:r>
     </w:p>
     <w:p>
@@ -4516,7 +4546,7 @@
         <w:jc w:val="both"/>
       </w:pPr>
       <w:r>
-        <w:t xml:space="preserve">Accuracy depends on how complete and consistent the supplier's records are, and the route simulation needs delivery areas and trip records that may not exist.</w:t>
+        <w:t xml:space="preserve">Accuracy depends on how complete and consistent the records are, and the route and stock simulations need delivery area, trip and stock records that may not exist.</w:t>
       </w:r>
     </w:p>
     <w:p>
@@ -4526,7 +4556,7 @@
         <w:jc w:val="both"/>
       </w:pPr>
       <w:r>
-        <w:t xml:space="preserve">The study does not cover water quality, product claims, sanitation compliance, pricing, automatic ordering, sensors or container tracking.</w:t>
+        <w:t xml:space="preserve">The stock balancing test needs an agreed assumption about how stock is moved between San Juan and Marikina and what it costs, which the owner would have to provide.</w:t>
       </w:r>
     </w:p>
     <w:p>
@@ -4536,7 +4566,17 @@
         <w:jc w:val="both"/>
       </w:pPr>
       <w:r>
-        <w:t xml:space="preserve">A supplier that keeps only a notebook, chat messages or monthly totals would not meet the data requirement unless the records are typed in.</w:t>
+        <w:t xml:space="preserve">The study does not cover water quality, product claims, sanitation compliance, pricing, automatic ordering, sensors or container tracking.</w:t>
+      </w:r>
+    </w:p>
+    <w:p>
+      <w:pPr>
+        <w:pStyle w:val="ListBullet"/>
+        <w:spacing w:after="60"/>
+        <w:jc w:val="both"/>
+      </w:pPr>
+      <w:r>
+        <w:t xml:space="preserve">A station that keeps only a notebook, chat messages or monthly totals would not meet the data requirement unless the records are typed in.</w:t>
       </w:r>
     </w:p>
     <w:p>
@@ -4621,7 +4661,7 @@
           <w:b w:val="0"/>
           <w:i w:val="0"/>
         </w:rPr>
-        <w:t xml:space="preserve">The study will demonstrate a complete data science workflow on a small Philippine business: data acquisition, cleaning, exploration, forecasting at several levels, a retention model, a routing simulation, evaluation and a usable dashboard. It may help the owner plan stock and deliveries and keep regular customers, and it may help other small water suppliers and students who want a local case study. The project has a cautious connection to SDG 6.1 through the reliability of a small drinking water supplier and to SDG 8.3 through the growth of small enterprises; it will not directly measure progress toward either goal. [The group should confirm the SDG with the adviser.]</w:t>
+        <w:t xml:space="preserve">The study will demonstrate a complete data science workflow on a small Philippine business with two sites: data acquisition, cleaning, exploration, forecasting at several levels, a retention model, routing and stock balancing simulations, evaluation and a usable dashboard. It may help the owner plan stock and deliveries across both stations and keep regular customers, and it may help other small water businesses and students who want a local case study. The project has a cautious connection to SDG 6.1 through the reliability of small drinking water suppliers and to SDG 8.3 through the growth of small enterprises; it will not directly measure progress toward either goal. [The group should confirm the SDG with the adviser.]</w:t>
       </w:r>
     </w:p>
     <w:p>
@@ -4648,7 +4688,7 @@
         <w:jc w:val="both"/>
       </w:pPr>
       <w:r>
-        <w:t xml:space="preserve">A documented and anonymized analysis dataset.</w:t>
+        <w:t xml:space="preserve">A documented and anonymized analysis dataset for both stations.</w:t>
       </w:r>
     </w:p>
     <w:p>
@@ -4658,7 +4698,7 @@
         <w:jc w:val="both"/>
       </w:pPr>
       <w:r>
-        <w:t xml:space="preserve">Exploratory visualizations of demand patterns.</w:t>
+        <w:t xml:space="preserve">Exploratory visualizations of demand patterns and a comparison of the two stations.</w:t>
       </w:r>
     </w:p>
     <w:p>
@@ -4668,7 +4708,7 @@
         <w:jc w:val="both"/>
       </w:pPr>
       <w:r>
-        <w:t xml:space="preserve">A comparison of forecasting models with MAE and WAPE, with reconciled product and channel forecasts.</w:t>
+        <w:t xml:space="preserve">A comparison of forecasting models with MAE and WAPE, including one pooled model against one model per station, with reconciled forecasts.</w:t>
       </w:r>
     </w:p>
     <w:p>
@@ -4688,7 +4728,7 @@
         <w:jc w:val="both"/>
       </w:pPr>
       <w:r>
-        <w:t xml:space="preserve">A dashboard with the forecast, the follow-up list and the route plan, and a discussion of the limits of one small supplier's data.</w:t>
+        <w:t xml:space="preserve">A dashboard with the forecasts, the follow-up list, the route plan and the stock balancing guide, and a discussion of the limits of two stations' data.</w:t>
       </w:r>
     </w:p>
     <w:p>
@@ -4720,21 +4760,6 @@
           <w:b w:val="0"/>
           <w:i w:val="0"/>
         </w:rPr>
-        <w:t xml:space="preserve">Akhmetbek, S. (2022). Forecasting customer future behavior in retail business using machine learning models. Scientific Journal of Astana IT University, 10, 45-60. doi:10.37943/ILMM7870</w:t>
-      </w:r>
-    </w:p>
-    <w:p>
-      <w:pPr>
-        <w:keepNext w:val="0"/>
-        <w:spacing w:after="80"/>
-        <w:ind w:left="720" w:hanging="720"/>
-        <w:jc w:val="left"/>
-      </w:pPr>
-      <w:r>
-        <w:rPr>
-          <w:b w:val="0"/>
-          <w:i w:val="0"/>
-        </w:rPr>
         <w:t xml:space="preserve">Bergmeir, C., &amp; Benítez, J. M. (2012). On the use of cross-validation for time series predictor evaluation. Information Sciences, 191, 192-213. doi:10.1016/j.ins.2011.12.028</w:t>
       </w:r>
     </w:p>
@@ -4810,21 +4835,6 @@
           <w:b w:val="0"/>
           <w:i w:val="0"/>
         </w:rPr>
-        <w:t xml:space="preserve">Dantzig, G. B., &amp; Ramser, J. H. (1959). The truck dispatching problem. Management Science, 6(1), 80-91. doi:10.1287/mnsc.6.1.80</w:t>
-      </w:r>
-    </w:p>
-    <w:p>
-      <w:pPr>
-        <w:keepNext w:val="0"/>
-        <w:spacing w:after="80"/>
-        <w:ind w:left="720" w:hanging="720"/>
-        <w:jc w:val="left"/>
-      </w:pPr>
-      <w:r>
-        <w:rPr>
-          <w:b w:val="0"/>
-          <w:i w:val="0"/>
-        </w:rPr>
         <w:t xml:space="preserve">Department of Health. (1999). Supplemental implementing rules and regulations of Chapter II (Water Supply) of the Code on Sanitation of the Philippines (PD 856). Retrieved from https://dev.lawyerly.ph/laws/48321</w:t>
       </w:r>
     </w:p>
@@ -4930,6 +4940,51 @@
           <w:b w:val="0"/>
           <w:i w:val="0"/>
         </w:rPr>
+        <w:t xml:space="preserve">Montero-Manso, P., &amp; Hyndman, R. J. (2021). Principles and algorithms for forecasting groups of time series: Locality and globality. International Journal of Forecasting, 37(4), 1632-1653. doi:10.1016/j.ijforecast.2021.03.004</w:t>
+      </w:r>
+    </w:p>
+    <w:p>
+      <w:pPr>
+        <w:keepNext w:val="0"/>
+        <w:spacing w:after="80"/>
+        <w:ind w:left="720" w:hanging="720"/>
+        <w:jc w:val="left"/>
+      </w:pPr>
+      <w:r>
+        <w:rPr>
+          <w:b w:val="0"/>
+          <w:i w:val="0"/>
+        </w:rPr>
+        <w:t xml:space="preserve">Montoya-Torres, J. R., López Franco, J., Nieto Isaza, S., Felizzola Jiménez, H., &amp; Herazo-Padilla, N. (2015). A literature review on the vehicle routing problem with multiple depots. Computers &amp; Industrial Engineering, 79, 115-129. doi:10.1016/j.cie.2014.10.029</w:t>
+      </w:r>
+    </w:p>
+    <w:p>
+      <w:pPr>
+        <w:keepNext w:val="0"/>
+        <w:spacing w:after="80"/>
+        <w:ind w:left="720" w:hanging="720"/>
+        <w:jc w:val="left"/>
+      </w:pPr>
+      <w:r>
+        <w:rPr>
+          <w:b w:val="0"/>
+          <w:i w:val="0"/>
+        </w:rPr>
+        <w:t xml:space="preserve">Paterson, C., Kiesmüller, G., Teunter, R., &amp; Glazebrook, K. (2011). Inventory models with lateral transshipments: A review. European Journal of Operational Research, 210(2), 125-136. doi:10.1016/j.ejor.2010.05.048</w:t>
+      </w:r>
+    </w:p>
+    <w:p>
+      <w:pPr>
+        <w:keepNext w:val="0"/>
+        <w:spacing w:after="80"/>
+        <w:ind w:left="720" w:hanging="720"/>
+        <w:jc w:val="left"/>
+      </w:pPr>
+      <w:r>
+        <w:rPr>
+          <w:b w:val="0"/>
+          <w:i w:val="0"/>
+        </w:rPr>
         <w:t xml:space="preserve">Presidential Decree No. 856. (1975). Code on sanitation of the Philippines. Retrieved from https://lpr.adb.org/sites/default/files/2024-05/philippines-presidential-decree-no-856-s-1975.pdf</w:t>
       </w:r>
     </w:p>
@@ -4976,21 +5031,6 @@
           <w:i w:val="0"/>
         </w:rPr>
         <w:t xml:space="preserve">United Nations. (2015). Transforming our world: The 2030 agenda for sustainable development. Retrieved from https://sdgs.un.org/2030agenda</w:t>
-      </w:r>
-    </w:p>
-    <w:p>
-      <w:pPr>
-        <w:keepNext w:val="0"/>
-        <w:spacing w:after="80"/>
-        <w:ind w:left="720" w:hanging="720"/>
-        <w:jc w:val="left"/>
-      </w:pPr>
-      <w:r>
-        <w:rPr>
-          <w:b w:val="0"/>
-          <w:i w:val="0"/>
-        </w:rPr>
-        <w:t xml:space="preserve">Verbeke, W., Dejaeger, K., Martens, D., Hur, J., &amp; Baesens, B. (2012). New insights into churn prediction in the telecommunication sector: A profit driven data mining approach. European Journal of Operational Research, 218(1), 211-229. doi:10.1016/j.ejor.2011.09.031</w:t>
       </w:r>
     </w:p>
     <w:p>

</xml_diff>